<commit_message>
fix: remove graduation year from resume
</commit_message>
<xml_diff>
--- a/resume.docx
+++ b/resume.docx
@@ -445,7 +445,7 @@
     </w:p>
     <w:bookmarkEnd w:id="32"/>
     <w:bookmarkEnd w:id="33"/>
-    <w:bookmarkStart w:id="34" w:name="education"/>
+    <w:bookmarkStart w:id="35" w:name="education"/>
     <w:p>
       <w:pPr>
         <w:pStyle w:val="Heading2"/>
@@ -454,27 +454,25 @@
         <w:t xml:space="preserve">Education</w:t>
       </w:r>
     </w:p>
+    <w:bookmarkStart w:id="34" w:name="X23564dd18a40b47afa7f776ab361b72f1359cd3"/>
+    <w:p>
+      <w:pPr>
+        <w:pStyle w:val="Heading3"/>
+      </w:pPr>
+      <w:r>
+        <w:t xml:space="preserve">Manhattan College | Bachelor of Arts (BA) in Computer Science</w:t>
+      </w:r>
+    </w:p>
     <w:p>
       <w:pPr>
         <w:pStyle w:val="FirstParagraph"/>
       </w:pPr>
       <w:r>
-        <w:rPr>
-          <w:b/>
-          <w:bCs/>
-        </w:rPr>
-        <w:t xml:space="preserve">Manhattan College | Bachelor of Arts (BA) in Computer Science</w:t>
-      </w:r>
-    </w:p>
-    <w:p>
-      <w:pPr>
-        <w:pStyle w:val="BodyText"/>
-      </w:pPr>
-      <w:r>
-        <w:t xml:space="preserve">Bronx, NY | 2011 | Magna cum laude | Phi Beta Kappa</w:t>
+        <w:t xml:space="preserve">Bronx, NY | Magna cum laude | Phi Beta Kappa</w:t>
       </w:r>
     </w:p>
     <w:bookmarkEnd w:id="34"/>
+    <w:bookmarkEnd w:id="35"/>
     <w:sectPr>
       <w:footnotePr>
         <w:numRestart w:val="eachSect"/>

</xml_diff>

<commit_message>
Clarify employment and selected projects
</commit_message>
<xml_diff>
--- a/resume.docx
+++ b/resume.docx
@@ -87,7 +87,7 @@
         <w:pStyle w:val="FirstParagraph"/>
       </w:pPr>
       <w:r>
-        <w:t xml:space="preserve">Senior frontend engineer with 4+ years of experience building and shipping high-performance JavaScript web applications and user interfaces for complex data. Built the frontend of JPMorgan Chase’s multi-grid analytics workspace over server-held datasets containing 100M+ rows and earned promotion to Vice President in two years. Expertise in frontend performance, virtualized rendering, WebSockets, state management, local-first architecture, Node.js, SQL, and automated testing. Seeking a full-time Senior Frontend Engineer or Frontend Software Engineer role.</w:t>
+        <w:t xml:space="preserve">Senior frontend engineer with 4+ years of experience building and shipping high-performance JavaScript applications for complex data and operational workflows. At JPMorgan Chase, served as primary frontend engineer for a multi-grid analytics workspace and earned promotion to Lead Software Engineer (Vice President) in two years. Expertise in frontend performance, virtualized rendering, WebSockets, state management, local-first architecture, Node.js, SQL, and automated testing. Seeking a full-time Senior Frontend Engineer or Frontend Software Engineer role.</w:t>
       </w:r>
     </w:p>
     <w:bookmarkEnd w:id="24"/>
@@ -173,7 +173,7 @@
       </w:r>
     </w:p>
     <w:bookmarkEnd w:id="25"/>
-    <w:bookmarkStart w:id="33" w:name="work-experience"/>
+    <w:bookmarkStart w:id="30" w:name="work-experience"/>
     <w:p>
       <w:pPr>
         <w:pStyle w:val="Heading2"/>
@@ -182,13 +182,13 @@
         <w:t xml:space="preserve">Work Experience</w:t>
       </w:r>
     </w:p>
-    <w:bookmarkStart w:id="28" w:name="Xb43a67675e5030fa45a343262ed8a96f8d63d68"/>
+    <w:bookmarkStart w:id="26" w:name="X2220ecd9cea25e04e7e56107b0122d06d6fa078"/>
     <w:p>
       <w:pPr>
         <w:pStyle w:val="Heading3"/>
       </w:pPr>
       <w:r>
-        <w:t xml:space="preserve">Tanji Systems | Independent Product Engineer</w:t>
+        <w:t xml:space="preserve">JPMorgan Chase | Lead Software Engineer (Vice President)</w:t>
       </w:r>
     </w:p>
     <w:p>
@@ -196,7 +196,7 @@
         <w:pStyle w:val="FirstParagraph"/>
       </w:pPr>
       <w:r>
-        <w:t xml:space="preserve">New York, NY | June 2026 - Present</w:t>
+        <w:t xml:space="preserve">New York, NY | February 2025 - May 2026</w:t>
       </w:r>
     </w:p>
     <w:p>
@@ -208,21 +208,7 @@
         </w:numPr>
       </w:pPr>
       <w:r>
-        <w:t xml:space="preserve">Shipped</w:t>
-      </w:r>
-      <w:r>
-        <w:t xml:space="preserve"> </w:t>
-      </w:r>
-      <w:hyperlink r:id="rId26">
-        <w:r>
-          <w:rPr>
-            <w:rStyle w:val="Hyperlink"/>
-          </w:rPr>
-          <w:t xml:space="preserve">Ingrid</w:t>
-        </w:r>
-      </w:hyperlink>
-      <w:r>
-        <w:t xml:space="preserve">, a local-first hierarchical grid application for structured notes and projects, using JavaScript, IndexedDB, and Dexie for client-side persistence plus production cloud synchronization and subscription billing.</w:t>
+        <w:t xml:space="preserve">Promoted from Software Engineer III (Associate) to Lead Software Engineer (Vice President) in two years.</w:t>
       </w:r>
     </w:p>
     <w:p>
@@ -234,43 +220,17 @@
         </w:numPr>
       </w:pPr>
       <w:r>
-        <w:t xml:space="preserve">Built</w:t>
-      </w:r>
-      <w:r>
-        <w:t xml:space="preserve"> </w:t>
-      </w:r>
-      <w:hyperlink r:id="rId27">
-        <w:r>
-          <w:rPr>
-            <w:rStyle w:val="Hyperlink"/>
-          </w:rPr>
-          <w:t xml:space="preserve">Showdown Elo</w:t>
-        </w:r>
-      </w:hyperlink>
-      <w:r>
-        <w:t xml:space="preserve">, an automated nightly Major League Baseball (MLB) ratings and data visualization product derived from 8M+ Statcast pitches; benchmarked rating models against betting markets and published the negative result.</w:t>
-      </w:r>
-    </w:p>
-    <w:p>
-      <w:pPr>
-        <w:pStyle w:val="Compact"/>
-        <w:numPr>
-          <w:ilvl w:val="0"/>
-          <w:numId w:val="1001"/>
-        </w:numPr>
-      </w:pPr>
-      <w:r>
-        <w:t xml:space="preserve">Owned end-to-end product engineering across product direction, frontend architecture, data modeling, user interface (UI) development, deployment, and automated testing.</w:t>
-      </w:r>
-    </w:p>
-    <w:bookmarkEnd w:id="28"/>
-    <w:bookmarkStart w:id="29" w:name="X2220ecd9cea25e04e7e56107b0122d06d6fa078"/>
+        <w:t xml:space="preserve">Evaluated large language model (LLM) workflows for legacy application modernization and created reusable project guidance and user interface (UI) component constraints for AI-generated code.</w:t>
+      </w:r>
+    </w:p>
+    <w:bookmarkEnd w:id="26"/>
+    <w:bookmarkStart w:id="27" w:name="Xde20d3585f1f10816529bdac6e9e1d979ebe69c"/>
     <w:p>
       <w:pPr>
         <w:pStyle w:val="Heading3"/>
       </w:pPr>
       <w:r>
-        <w:t xml:space="preserve">JPMorgan Chase | Lead Software Engineer (Vice President)</w:t>
+        <w:t xml:space="preserve">JPMorgan Chase | Software Engineer III (Associate)</w:t>
       </w:r>
     </w:p>
     <w:p>
@@ -278,7 +238,7 @@
         <w:pStyle w:val="FirstParagraph"/>
       </w:pPr>
       <w:r>
-        <w:t xml:space="preserve">New York, NY | February 2025 - May 2026</w:t>
+        <w:t xml:space="preserve">New York, NY | January 2023 - January 2025</w:t>
       </w:r>
     </w:p>
     <w:p>
@@ -290,7 +250,7 @@
         </w:numPr>
       </w:pPr>
       <w:r>
-        <w:t xml:space="preserve">Promoted from Software Engineer III (Associate) to Lead Software Engineer (Vice President) in two years.</w:t>
+        <w:t xml:space="preserve">Served as primary frontend engineer during the product’s first year, building a high-performance multi-grid analytics workspace on a small, fast-moving team.</w:t>
       </w:r>
     </w:p>
     <w:p>
@@ -302,17 +262,29 @@
         </w:numPr>
       </w:pPr>
       <w:r>
-        <w:t xml:space="preserve">Evaluated large language model (LLM) workflows for legacy application modernization and created reusable project guidance and user interface (UI) component constraints for AI-generated code.</w:t>
-      </w:r>
-    </w:p>
-    <w:bookmarkEnd w:id="29"/>
-    <w:bookmarkStart w:id="30" w:name="Xde20d3585f1f10816529bdac6e9e1d979ebe69c"/>
+        <w:t xml:space="preserve">Enabled users to explore, join, pivot, and retrieve server-held datasets containing 100M+ rows.</w:t>
+      </w:r>
+    </w:p>
+    <w:p>
+      <w:pPr>
+        <w:pStyle w:val="Compact"/>
+        <w:numPr>
+          <w:ilvl w:val="0"/>
+          <w:numId w:val="1002"/>
+        </w:numPr>
+      </w:pPr>
+      <w:r>
+        <w:t xml:space="preserve">Implemented virtualized rendering, visible-window data fetching over WebSockets, client-side caching, and state management to keep every grid responsive.</w:t>
+      </w:r>
+    </w:p>
+    <w:bookmarkEnd w:id="27"/>
+    <w:bookmarkStart w:id="28" w:name="okg-tech-software-engineer"/>
     <w:p>
       <w:pPr>
         <w:pStyle w:val="Heading3"/>
       </w:pPr>
       <w:r>
-        <w:t xml:space="preserve">JPMorgan Chase | Software Engineer III (Associate)</w:t>
+        <w:t xml:space="preserve">OKG Tech | Software Engineer</w:t>
       </w:r>
     </w:p>
     <w:p>
@@ -320,7 +292,7 @@
         <w:pStyle w:val="FirstParagraph"/>
       </w:pPr>
       <w:r>
-        <w:t xml:space="preserve">New York, NY | January 2023 - January 2025</w:t>
+        <w:t xml:space="preserve">New York, NY | March 2022 - December 2022</w:t>
       </w:r>
     </w:p>
     <w:p>
@@ -332,7 +304,7 @@
         </w:numPr>
       </w:pPr>
       <w:r>
-        <w:t xml:space="preserve">Served as primary frontend engineer during the product’s first year, building a high-performance multi-grid analytics workspace on a small, fast-moving team.</w:t>
+        <w:t xml:space="preserve">Shipped an updated bus-ticketing application using React and Node.js as the primary implementation engineer on a team of four.</w:t>
       </w:r>
     </w:p>
     <w:p>
@@ -344,29 +316,17 @@
         </w:numPr>
       </w:pPr>
       <w:r>
-        <w:t xml:space="preserve">Enabled users to explore, join, pivot, and retrieve server-held datasets containing 100M+ rows.</w:t>
-      </w:r>
-    </w:p>
-    <w:p>
-      <w:pPr>
-        <w:pStyle w:val="Compact"/>
-        <w:numPr>
-          <w:ilvl w:val="0"/>
-          <w:numId w:val="1003"/>
-        </w:numPr>
-      </w:pPr>
-      <w:r>
-        <w:t xml:space="preserve">Implemented virtualized rendering, visible-window data fetching over WebSockets, client-side caching, and state management to keep every grid responsive.</w:t>
-      </w:r>
-    </w:p>
-    <w:bookmarkEnd w:id="30"/>
-    <w:bookmarkStart w:id="31" w:name="okg-tech-software-engineer"/>
+        <w:t xml:space="preserve">Developed scheduling, vaccination, appointment reminder, and clinical workflow features integrated with eClinicalWorks and existing operational systems.</w:t>
+      </w:r>
+    </w:p>
+    <w:bookmarkEnd w:id="28"/>
+    <w:bookmarkStart w:id="29" w:name="yunshang-tea-co-founder"/>
     <w:p>
       <w:pPr>
         <w:pStyle w:val="Heading3"/>
       </w:pPr>
       <w:r>
-        <w:t xml:space="preserve">OKG Tech | Software Engineer</w:t>
+        <w:t xml:space="preserve">Yunshang Tea | Co-Founder</w:t>
       </w:r>
     </w:p>
     <w:p>
@@ -374,7 +334,7 @@
         <w:pStyle w:val="FirstParagraph"/>
       </w:pPr>
       <w:r>
-        <w:t xml:space="preserve">New York, NY | March 2022 - December 2022</w:t>
+        <w:t xml:space="preserve">Zhejiang, China | September 2015 - November 2021</w:t>
       </w:r>
     </w:p>
     <w:p>
@@ -386,7 +346,7 @@
         </w:numPr>
       </w:pPr>
       <w:r>
-        <w:t xml:space="preserve">Shipped an updated bus-ticketing application using React and Node.js as the primary implementation engineer on a team of four.</w:t>
+        <w:t xml:space="preserve">Managed retail and wholesale operations for a specialty tea business.</w:t>
       </w:r>
     </w:p>
     <w:p>
@@ -398,25 +358,18 @@
         </w:numPr>
       </w:pPr>
       <w:r>
-        <w:t xml:space="preserve">Developed scheduling, vaccination, appointment reminder, and clinical workflow features integrated with eClinicalWorks and existing operational systems.</w:t>
-      </w:r>
-    </w:p>
-    <w:bookmarkEnd w:id="31"/>
-    <w:bookmarkStart w:id="32" w:name="yunshang-tea-co-founder"/>
-    <w:p>
-      <w:pPr>
-        <w:pStyle w:val="Heading3"/>
-      </w:pPr>
-      <w:r>
-        <w:t xml:space="preserve">Yunshang Tea | Co-Founder</w:t>
-      </w:r>
-    </w:p>
-    <w:p>
-      <w:pPr>
-        <w:pStyle w:val="FirstParagraph"/>
-      </w:pPr>
-      <w:r>
-        <w:t xml:space="preserve">Zhejiang, China | September 2015 - November 2021</w:t>
+        <w:t xml:space="preserve">Built database workflows for inventory, sales, and business operations.</w:t>
+      </w:r>
+    </w:p>
+    <w:bookmarkEnd w:id="29"/>
+    <w:bookmarkEnd w:id="30"/>
+    <w:bookmarkStart w:id="33" w:name="selected-projects"/>
+    <w:p>
+      <w:pPr>
+        <w:pStyle w:val="Heading2"/>
+      </w:pPr>
+      <w:r>
+        <w:t xml:space="preserve">Selected Projects</w:t>
       </w:r>
     </w:p>
     <w:p>
@@ -427,8 +380,35 @@
           <w:numId w:val="1005"/>
         </w:numPr>
       </w:pPr>
-      <w:r>
-        <w:t xml:space="preserve">Managed retail and wholesale operations for a specialty tea business.</w:t>
+      <w:hyperlink r:id="rId31">
+        <w:r>
+          <w:rPr>
+            <w:rStyle w:val="Hyperlink"/>
+            <w:b/>
+            <w:bCs/>
+          </w:rPr>
+          <w:t xml:space="preserve">Ingrid</w:t>
+        </w:r>
+      </w:hyperlink>
+      <w:r>
+        <w:rPr>
+          <w:b/>
+          <w:bCs/>
+        </w:rPr>
+        <w:t xml:space="preserve"> </w:t>
+      </w:r>
+      <w:r>
+        <w:rPr>
+          <w:b/>
+          <w:bCs/>
+        </w:rPr>
+        <w:t xml:space="preserve">(2026):</w:t>
+      </w:r>
+      <w:r>
+        <w:t xml:space="preserve"> </w:t>
+      </w:r>
+      <w:r>
+        <w:t xml:space="preserve">Built a local-first hierarchical grid application using JavaScript, IndexedDB, and Dexie for client-side persistence, with production cloud synchronization, subscription billing, and automated release tests.</w:t>
       </w:r>
     </w:p>
     <w:p>
@@ -439,11 +419,37 @@
           <w:numId w:val="1005"/>
         </w:numPr>
       </w:pPr>
-      <w:r>
-        <w:t xml:space="preserve">Built database workflows for inventory, sales, and business operations.</w:t>
-      </w:r>
-    </w:p>
-    <w:bookmarkEnd w:id="32"/>
+      <w:hyperlink r:id="rId32">
+        <w:r>
+          <w:rPr>
+            <w:rStyle w:val="Hyperlink"/>
+            <w:b/>
+            <w:bCs/>
+          </w:rPr>
+          <w:t xml:space="preserve">Showdown Elo</w:t>
+        </w:r>
+      </w:hyperlink>
+      <w:r>
+        <w:rPr>
+          <w:b/>
+          <w:bCs/>
+        </w:rPr>
+        <w:t xml:space="preserve"> </w:t>
+      </w:r>
+      <w:r>
+        <w:rPr>
+          <w:b/>
+          <w:bCs/>
+        </w:rPr>
+        <w:t xml:space="preserve">(2026):</w:t>
+      </w:r>
+      <w:r>
+        <w:t xml:space="preserve"> </w:t>
+      </w:r>
+      <w:r>
+        <w:t xml:space="preserve">Built an automated nightly Major League Baseball (MLB) ratings and data visualization publication derived from 8M+ Statcast pitches; benchmarked the models against betting markets and published the negative result.</w:t>
+      </w:r>
+    </w:p>
     <w:bookmarkEnd w:id="33"/>
     <w:bookmarkStart w:id="35" w:name="education"/>
     <w:p>

</xml_diff>

<commit_message>
Remove unsupported testing claims
</commit_message>
<xml_diff>
--- a/resume.docx
+++ b/resume.docx
@@ -87,7 +87,7 @@
         <w:pStyle w:val="FirstParagraph"/>
       </w:pPr>
       <w:r>
-        <w:t xml:space="preserve">Senior frontend engineer with 4+ years of experience building and shipping high-performance JavaScript applications for complex data and operational workflows. At JPMorgan Chase, served as primary frontend engineer for a multi-grid analytics workspace and earned promotion to Lead Software Engineer (Vice President) in two years. Expertise in frontend performance, virtualized rendering, WebSockets, state management, local-first architecture, Node.js, SQL, and automated testing. Seeking a full-time Senior Frontend Engineer or Frontend Software Engineer role.</w:t>
+        <w:t xml:space="preserve">Senior frontend engineer with 4+ years of experience building and shipping high-performance JavaScript applications for complex data and operational workflows. At JPMorgan Chase, served as primary frontend engineer for a multi-grid analytics workspace and earned promotion to Lead Software Engineer (Vice President) in two years. Expertise in frontend performance, virtualized rendering, WebSockets, state management, local-first architecture, Node.js, and SQL. Seeking a full-time Senior Frontend Engineer or Frontend Software Engineer role.</w:t>
       </w:r>
     </w:p>
     <w:bookmarkEnd w:id="24"/>
@@ -169,7 +169,7 @@
         <w:t xml:space="preserve"> </w:t>
       </w:r>
       <w:r>
-        <w:t xml:space="preserve">Git, automated testing, unit testing, integration testing, end-to-end testing, deployment</w:t>
+        <w:t xml:space="preserve">Git, deployment</w:t>
       </w:r>
     </w:p>
     <w:bookmarkEnd w:id="25"/>
@@ -408,7 +408,7 @@
         <w:t xml:space="preserve"> </w:t>
       </w:r>
       <w:r>
-        <w:t xml:space="preserve">Built a local-first hierarchical grid application using JavaScript, IndexedDB, and Dexie for client-side persistence, with production cloud synchronization, subscription billing, and automated release tests.</w:t>
+        <w:t xml:space="preserve">Built a local-first hierarchical grid application using JavaScript, IndexedDB, and Dexie for client-side persistence, with production cloud synchronization and subscription billing.</w:t>
       </w:r>
     </w:p>
     <w:p>

</xml_diff>